<commit_message>
Update plate hypotheses and 3D supplements with final h data
Extract active Vp anomaly fragments, refit purple Nazca and orange Caribbean NURBS, and compare independent cell-weighted k-means partitions with the historical diagonal. Add geometric holdouts, source hashes, validation checks and manuscript methods/results while retaining the adverse tomography controls.
</commit_message>
<xml_diff>
--- a/tomografia_colombia_uis/articulo_boletin_geologia_uis_adjunto/Manuscrito_tomografia_Vp_Colombia_UIS_revision_20261011h.docx
+++ b/tomografia_colombia_uis/articulo_boletin_geologia_uis_adjunto/Manuscrito_tomografia_Vp_Colombia_UIS_revision_20261011h.docx
@@ -756,6 +756,40 @@
       </w:pPr>
       <w:r>
         <w:t>El contraste de elevación repite el control 1D fijo cambiando únicamente las cotas a cero, con los mismos criterios de parada. Se regresan las estáticas contra elevación, latitud y longitud y se remuestrean estaciones pareadas; ese intervalo no representa dependencia espacial ni covariables geológicas. Una reserva espacial auxiliar usa tres bandas de latitud, con exclusión de entrenamiento a 20 km del grupo reservado, tres rondas y penalización de incrementos. Sus resultados se mantienen separados del protocolo de convergencia y regularización absoluta.</w:t>
+      </w:r>
+    </w:p>
+    <w:p>
+      <w:pPr>
+        <w:pStyle w:val="Heading2"/>
+        <w:spacing w:before="160" w:after="40"/>
+        <w:jc w:val="left"/>
+      </w:pPr>
+      <w:r>
+        <w:t>3.5 Hipótesis geométricas de Nazca y Caribe</w:t>
+      </w:r>
+    </w:p>
+    <w:p>
+      <w:pPr>
+        <w:jc w:val="both"/>
+      </w:pPr>
+      <w:r>
+        <w:t>El análisis geométrico se actualiza con el volumen final del brazo λ = 20 y los 2897 eventos de entrenamiento relocalizados, sin modificar la inversión. Extraemos fragmentos de isovalores de ΔVp = 100(Vp final/Vp inicial − 1), a ±1, ±3 y ±5 %, mediante tetraedros sobre muestreo de 20 km. Solo se usan cubos cuyos ocho vértices pertenecen al soporte activo y tienen profundidad ≥40 km; no se cierran los huecos con valores artificiales. Son fragmentos de anomalías calculadas que se someten a interpretación, no interfaces tectónicas recuperadas de forma validada.</w:t>
+      </w:r>
+    </w:p>
+    <w:p>
+      <w:pPr>
+        <w:jc w:val="both"/>
+      </w:pPr>
+      <w:r>
+        <w:t>Para examinar la división espacial usamos 1160 eventos con profundidad ≥40 km y brecha ≤180°, agregados en 706 celdas tridimensionales de 20 km con igual peso por celda. K-means recibe únicamente las medianas x, y y profundidad; la diagonal y Slab2 no participan en su ajuste. Se comparan k = 2–6 con 30 inicializaciones, distancia euclidiana en km y coordenadas estandarizadas. Se selecciona la menor inercia de cada conjunto y se informa la silueta. El acuerdo con la diagonal se calcula después, maximizando sobre la permutación de las dos etiquetas. Los bisectores de k = 2 se representan a 60, 80 y 100 km; por construcción dependen de la profundidad y de la métrica.</w:t>
+      </w:r>
+    </w:p>
+    <w:p>
+      <w:pPr>
+        <w:jc w:val="both"/>
+      </w:pPr>
+      <w:r>
+        <w:t>La hipótesis tectónica conserva la asignación geográfica histórica: Nazca al suroccidente y Caribe al nororiente de la diagonal entre 72,5° O, 6,0° N y 76,3° O, 9,2° N. Sus superficies se reajustan como NURBS cúbicas con pesos racionales unitarios, caso particular B-spline, utilizando 14 × 18 y 10 × 14 controles y penalizaciones de segunda diferencia de 0,8 y 2, respectivamente. Las profundidades de los coeficientes se acotan entre 10 y 180 km; tres actualizaciones robustas reducen el peso de residuales verticales mayores de 15 km. Nazca incorpora anclajes débiles Slab2 SAM (Hayes et al., 2018), desplazados nominalmente 15 km, con pesos 0,15 × 8/clip(σ,5,30); no se descartan sismos por incompatibilidad con Slab2. Caribe usa profundidades del control sísmico más próximo en una envolvente de 75 km con peso 0,12, sin anclajes Slab2 Caribe. La envolvente recorta la representación y no acredita iluminación. Mayor opacidad exige proximidad 3D ≤40 km a controles y soporte Vp activo; el resto muestra continuidad interpolada. El espesor de 30 km es un escenario geométrico y no se usa para alterar velocidades. La clasificación NURBS sigue la diagonal propuesta, mientras k-means es un contraste independiente de esa asignación; ninguno impone un contacto común en profundidad.</w:t>
       </w:r>
     </w:p>
     <w:p>
@@ -3415,6 +3449,93 @@
     </w:p>
     <w:p>
       <w:pPr>
+        <w:pStyle w:val="Heading2"/>
+        <w:spacing w:before="160" w:after="40"/>
+        <w:jc w:val="left"/>
+      </w:pPr>
+      <w:r>
+        <w:t>4.7 Geometrías candidatas y división espacial</w:t>
+      </w:r>
+    </w:p>
+    <w:p>
+      <w:pPr>
+        <w:jc w:val="both"/>
+      </w:pPr>
+      <w:r>
+        <w:t>Entre k = 2–6, la mayor silueta corresponde a dos grupos en ambas métricas. En km, k = 2 obtiene silueta 0,585 y acuerdo de 90,1 % con la diagonal geográfica; los 30 de 30 inicios coinciden al menos en 99 % tras permutar etiquetas. Con coordenadas estandarizadas, la silueta es 0,444 y el acuerdo es 91,8 %. Estas cifras documentan una organización espacial reproducible del conjunto; la diagonal no fue estimada por k-means y la similitud de etiquetas no demuestra coincidencia de líneas ni identidad tectónica.</w:t>
+      </w:r>
+    </w:p>
+    <w:p>
+      <w:pPr>
+        <w:jc w:val="both"/>
+      </w:pPr>
+      <w:r>
+        <w:t>La superficie candidata Nazca se ajusta a 438 controles de celdas, con RMS vertical de 30,66 km. Tiene 35982 triángulos, de los cuales 16302 (45,3 %) cumplen el criterio combinado de proximidad y soporte activo. Para 242 eventos reservados con profundidad ≥40 km, dentro de la misma región geográfica y envolvente lateral, el RMS vertical es 25,59 km. Esos eventos conservan sus coordenadas de catálogo y no intervinieron en el ajuste; no se filtraron por brecha ni compatibilidad con Slab2. Los errores verticales geométricos comparan poblaciones distintas de celdas y eventos, y no son incertidumbres hipocentrales ni RMS de tiempos.</w:t>
+      </w:r>
+    </w:p>
+    <w:p>
+      <w:pPr>
+        <w:jc w:val="both"/>
+      </w:pPr>
+      <w:r>
+        <w:t>La superficie candidata Caribe se ajusta a 268 controles de celdas, con RMS vertical de 24,84 km. Tiene 16912 triángulos, de los cuales 10918 (64,6 %) cumplen el criterio combinado de proximidad y soporte activo. Para 131 eventos reservados con profundidad ≥40 km, dentro de la misma región geográfica y envolvente lateral, el RMS vertical es 19,24 km. Esos eventos conservan sus coordenadas de catálogo y no intervinieron en el ajuste; no se filtraron por brecha ni compatibilidad con Slab2. Los errores verticales geométricos comparan poblaciones distintas de celdas y eventos, y no son incertidumbres hipocentrales ni RMS de tiempos.</w:t>
+      </w:r>
+    </w:p>
+    <w:p>
+      <w:pPr>
+        <w:jc w:val="both"/>
+      </w:pPr>
+      <w:r>
+        <w:t>Los tres suplementos interactivos permiten evaluar conjuntamente las anomalías, las superficies continuas y los bisectores. En el primero, los fragmentos corresponden a isovalores del volumen final; en el segundo, Nazca se representa en morado y Caribe en naranja junto con los sismos SGC; en el tercero se puede cambiar k y la métrica. La continuidad de una superficie y su nombre tectónico constituyen la hipótesis sometida a evaluación, no una consecuencia automática del ajuste numérico.</w:t>
+      </w:r>
+    </w:p>
+    <w:p>
+      <w:pPr>
+        <w:spacing w:line="240" w:lineRule="auto"/>
+        <w:jc w:val="both"/>
+      </w:pPr>
+      <w:hyperlink r:id="rId13">
+        <w:r>
+          <w:rPr>
+            <w:color w:val="000000"/>
+            <w:rFonts w:ascii="Times New Roman" w:hAnsi="Times New Roman"/>
+          </w:rPr>
+          <w:t>Anomalías Vp y sismos en 3D</w:t>
+        </w:r>
+      </w:hyperlink>
+    </w:p>
+    <w:p>
+      <w:pPr>
+        <w:spacing w:line="240" w:lineRule="auto"/>
+        <w:jc w:val="both"/>
+      </w:pPr>
+      <w:hyperlink r:id="rId14">
+        <w:r>
+          <w:rPr>
+            <w:color w:val="000000"/>
+            <w:rFonts w:ascii="Times New Roman" w:hAnsi="Times New Roman"/>
+          </w:rPr>
+          <w:t>Nazca morada y Caribe naranja reconstruidas con NURBS</w:t>
+        </w:r>
+      </w:hyperlink>
+    </w:p>
+    <w:p>
+      <w:pPr>
+        <w:spacing w:line="240" w:lineRule="auto"/>
+        <w:jc w:val="both"/>
+      </w:pPr>
+      <w:hyperlink r:id="rId15">
+        <w:r>
+          <w:rPr>
+            <w:color w:val="000000"/>
+            <w:rFonts w:ascii="Times New Roman" w:hAnsi="Times New Roman"/>
+          </w:rPr>
+          <w:t>División espacial y sensibilidad k-means</w:t>
+        </w:r>
+      </w:hyperlink>
+    </w:p>
+    <w:p>
+      <w:pPr>
         <w:pStyle w:val="Heading1"/>
         <w:spacing w:before="160" w:after="40"/>
         <w:jc w:val="left"/>
@@ -3428,6 +3549,14 @@
         <w:jc w:val="both"/>
       </w:pPr>
       <w:r>
+        <w:t>Proponemos evaluar si la agrupación suroccidental es compatible con Nazca y la nororiental con Caribe, y si los fragmentos de anomalías coinciden con esos dominios. El acuerdo de k-means con una clasificación planteada previamente apoya su plausibilidad espacial, pero puede reflejar la distribución del catálogo y no una interfaz de placas. Las NURBS usan esa clasificación, por lo que su separación no es una segunda estimación independiente del límite. Una confirmación tectónica exigiría estabilidad al cambiar población y métrica, recuperación sintética a las escalas interpretadas, restricciones de mecanismos e interfaces y contraste con modelos regionales independientes. Aquí publicamos las superficies, los bisectores y los criterios para someter esa hipótesis a evaluación, manteniendo los resultados adversos de recuperación y predicción.</w:t>
+      </w:r>
+    </w:p>
+    <w:p>
+      <w:pPr>
+        <w:jc w:val="both"/>
+      </w:pPr>
+      <w:r>
         <w:t>El contraste exige un control capaz de modificar el perfil en profundidad. Comparar solo contra una referencia fija puede atribuir a variaciones laterales una corrección que admite una explicación 1D. El brazo ajustable reduce ese sesgo de diseño, pero conserva un número finito de parámetros, penalización y límites de paso; no se afirma que sea un mínimo global de velocidad. Las trayectorias separan estabilización iterativa de una mejor predicción fuera del ajuste.</w:t>
       </w:r>
     </w:p>
@@ -3499,6 +3628,14 @@
     </w:p>
     <w:p>
       <w:pPr>
+        <w:jc w:val="both"/>
+      </w:pPr>
+      <w:r>
+        <w:t>La organización de la sismicidad en dos dominios motiva la hipótesis Nazca–Caribe publicada en los suplementos 3D. Las NURBS representan esa hipótesis con continuidad explícitamente interpolada; los fragmentos de Vp y la división k-means se ofrecen para contrastarla. La identidad tectónica, el contacto entre superficies y la asociación de las anomalías permanecen sujetos a evaluación independiente.</w:t>
+      </w:r>
+    </w:p>
+    <w:p>
+      <w:pPr>
         <w:pStyle w:val="Heading1"/>
         <w:spacing w:before="160" w:after="40"/>
         <w:jc w:val="left"/>
@@ -3538,15 +3675,15 @@
         <w:jc w:val="both"/>
       </w:pPr>
       <w:r>
-        <w:t>El paquete de reproducción contiene observaciones seleccionadas, particiones, procedencia, configuraciones, código, modelos, predicciones, pruebas y huellas SHA256. Se distribuye en la rama tomografia-colombia-uis-h del repositorio público romusan/relocation-pwave-tomography, dentro de tomografia_colombia_uis. Los enlaces locales siguientes son portables dentro del paquete descargado. Las vistas geométricas conservan su población y cálculo originales, identificados en sus avisos; no son productos de la inversión presentada aquí. El repositorio no tiene DOI.</w:t>
-      </w:r>
-    </w:p>
-    <w:p>
-      <w:pPr>
-        <w:spacing w:line="240" w:lineRule="auto"/>
-        <w:jc w:val="both"/>
-      </w:pPr>
-      <w:hyperlink r:id="rId13">
+        <w:t>El paquete de reproducción contiene observaciones seleccionadas, particiones, procedencia, configuraciones, código, modelos, predicciones, pruebas y huellas SHA256. Se distribuye en la rama tomografia-colombia-uis-h del repositorio público romusan/relocation-pwave-tomography, dentro de tomografia_colombia_uis. Los enlaces locales siguientes son portables dentro del paquete descargado. Los tres HTML geométricos se regeneraron con los datos de la campaña final h. Los resultados, celdas y etiquetas k-means, bisectores, parámetros NURBS y hashes de procedencia se incluyen en hipotesis_placas. El repositorio no tiene DOI.</w:t>
+      </w:r>
+    </w:p>
+    <w:p>
+      <w:pPr>
+        <w:spacing w:line="240" w:lineRule="auto"/>
+        <w:jc w:val="both"/>
+      </w:pPr>
+      <w:hyperlink r:id="rId16">
         <w:r>
           <w:rPr>
             <w:color w:val="000000"/>
@@ -3561,7 +3698,7 @@
         <w:spacing w:line="240" w:lineRule="auto"/>
         <w:jc w:val="both"/>
       </w:pPr>
-      <w:hyperlink r:id="rId14">
+      <w:hyperlink r:id="rId17">
         <w:r>
           <w:rPr>
             <w:color w:val="000000"/>
@@ -3576,7 +3713,7 @@
         <w:spacing w:line="240" w:lineRule="auto"/>
         <w:jc w:val="both"/>
       </w:pPr>
-      <w:hyperlink r:id="rId15">
+      <w:hyperlink r:id="rId18">
         <w:r>
           <w:rPr>
             <w:color w:val="000000"/>
@@ -3591,7 +3728,7 @@
         <w:spacing w:line="240" w:lineRule="auto"/>
         <w:jc w:val="both"/>
       </w:pPr>
-      <w:hyperlink r:id="rId16">
+      <w:hyperlink r:id="rId19">
         <w:r>
           <w:rPr>
             <w:color w:val="000000"/>
@@ -3606,7 +3743,7 @@
         <w:spacing w:line="240" w:lineRule="auto"/>
         <w:jc w:val="both"/>
       </w:pPr>
-      <w:hyperlink r:id="rId17">
+      <w:hyperlink r:id="rId20">
         <w:r>
           <w:rPr>
             <w:color w:val="000000"/>
@@ -3621,7 +3758,7 @@
         <w:spacing w:line="240" w:lineRule="auto"/>
         <w:jc w:val="both"/>
       </w:pPr>
-      <w:hyperlink r:id="rId18">
+      <w:hyperlink r:id="rId21">
         <w:r>
           <w:rPr>
             <w:color w:val="000000"/>
@@ -3636,7 +3773,7 @@
         <w:spacing w:line="240" w:lineRule="auto"/>
         <w:jc w:val="both"/>
       </w:pPr>
-      <w:hyperlink r:id="rId19">
+      <w:hyperlink r:id="rId22">
         <w:r>
           <w:rPr>
             <w:color w:val="000000"/>
@@ -3651,7 +3788,7 @@
         <w:spacing w:line="240" w:lineRule="auto"/>
         <w:jc w:val="both"/>
       </w:pPr>
-      <w:hyperlink r:id="rId20">
+      <w:hyperlink r:id="rId13">
         <w:r>
           <w:rPr>
             <w:color w:val="000000"/>
@@ -3666,7 +3803,7 @@
         <w:spacing w:line="240" w:lineRule="auto"/>
         <w:jc w:val="both"/>
       </w:pPr>
-      <w:hyperlink r:id="rId21">
+      <w:hyperlink r:id="rId14">
         <w:r>
           <w:rPr>
             <w:color w:val="000000"/>
@@ -3681,7 +3818,7 @@
         <w:spacing w:line="240" w:lineRule="auto"/>
         <w:jc w:val="both"/>
       </w:pPr>
-      <w:hyperlink r:id="rId22">
+      <w:hyperlink r:id="rId15">
         <w:r>
           <w:rPr>
             <w:color w:val="000000"/>
@@ -3693,6 +3830,51 @@
     </w:p>
     <w:p>
       <w:pPr>
+        <w:spacing w:line="240" w:lineRule="auto"/>
+        <w:jc w:val="both"/>
+      </w:pPr>
+      <w:hyperlink r:id="rId23">
+        <w:r>
+          <w:rPr>
+            <w:color w:val="000000"/>
+            <w:rFonts w:ascii="Times New Roman" w:hAnsi="Times New Roman"/>
+          </w:rPr>
+          <w:t>Métodos y procedencia de las hipótesis 3D</w:t>
+        </w:r>
+      </w:hyperlink>
+    </w:p>
+    <w:p>
+      <w:pPr>
+        <w:spacing w:line="240" w:lineRule="auto"/>
+        <w:jc w:val="both"/>
+      </w:pPr>
+      <w:hyperlink r:id="rId24">
+        <w:r>
+          <w:rPr>
+            <w:color w:val="000000"/>
+            <w:rFonts w:ascii="Times New Roman" w:hAnsi="Times New Roman"/>
+          </w:rPr>
+          <w:t>Métricas k-means por k y métrica espacial</w:t>
+        </w:r>
+      </w:hyperlink>
+    </w:p>
+    <w:p>
+      <w:pPr>
+        <w:spacing w:line="240" w:lineRule="auto"/>
+        <w:jc w:val="both"/>
+      </w:pPr>
+      <w:hyperlink r:id="rId25">
+        <w:r>
+          <w:rPr>
+            <w:color w:val="000000"/>
+            <w:rFonts w:ascii="Times New Roman" w:hAnsi="Times New Roman"/>
+          </w:rPr>
+          <w:t>Celdas y clasificación espacial reproducible</w:t>
+        </w:r>
+      </w:hyperlink>
+    </w:p>
+    <w:p>
+      <w:pPr>
         <w:pStyle w:val="Heading1"/>
         <w:spacing w:before="160" w:after="40"/>
         <w:jc w:val="left"/>
@@ -3759,6 +3941,16 @@
       </w:pPr>
       <w:r>
         <w:t>Fong, D. C. L.; Saunders, M. (2011). LSMR: An Iterative Algorithm for Sparse Least-Squares Problems. SIAM Journal on Scientific Computing, 33(5), 2950-2971. https://doi.org/10.1137/10079687x (artículo en revista).</w:t>
+      </w:r>
+    </w:p>
+    <w:p>
+      <w:pPr>
+        <w:keepLines/>
+        <w:spacing w:line="240" w:lineRule="auto"/>
+        <w:jc w:val="left"/>
+      </w:pPr>
+      <w:r>
+        <w:t>Hayes, G. P.; Moore, G. L.; Portner, D. E.; Hearne, M.; Flamme, H.; Furtney, M.; Smoczyk, G. M. (2018). Slab2, a comprehensive subduction zone geometry model. Science, 362(6410), 58-61. https://doi.org/10.1126/science.aat4723 (artículo en revista).</w:t>
       </w:r>
     </w:p>
     <w:p>

</xml_diff>

<commit_message>
Include isometric plate and k-means figures in UIS manuscript
</commit_message>
<xml_diff>
--- a/tomografia_colombia_uis/articulo_boletin_geologia_uis_adjunto/Manuscrito_tomografia_Vp_Colombia_UIS_revision_20261011h.docx
+++ b/tomografia_colombia_uis/articulo_boletin_geologia_uis_adjunto/Manuscrito_tomografia_Vp_Colombia_UIS_revision_20261011h.docx
@@ -3491,10 +3491,120 @@
     </w:p>
     <w:p>
       <w:pPr>
-        <w:spacing w:line="240" w:lineRule="auto"/>
-        <w:jc w:val="both"/>
-      </w:pPr>
-      <w:hyperlink r:id="rId13">
+        <w:jc w:val="both"/>
+      </w:pPr>
+      <w:r>
+        <w:t>La Figura 3 presenta las superficies candidatas de Nazca y Caribe en vista isométrica; la Figura 4 muestra los grupos espaciales y los bisectores del ajuste k-means con k = 2 en km. Ambas utilizan los mismos datos de sus suplementos interactivos y fronteras en superficie.</w:t>
+      </w:r>
+    </w:p>
+    <w:p>
+      <w:pPr>
+        <w:keepNext/>
+        <w:spacing w:line="240" w:lineRule="auto"/>
+        <w:jc w:val="center"/>
+      </w:pPr>
+      <w:r>
+        <w:drawing>
+          <wp:inline xmlns:a="http://schemas.openxmlformats.org/drawingml/2006/main" xmlns:pic="http://schemas.openxmlformats.org/drawingml/2006/picture">
+            <wp:extent cx="5778000" cy="4622400"/>
+            <wp:docPr id="3" name="Picture 3"/>
+            <wp:cNvGraphicFramePr>
+              <a:graphicFrameLocks noChangeAspect="1"/>
+            </wp:cNvGraphicFramePr>
+            <a:graphic>
+              <a:graphicData uri="http://schemas.openxmlformats.org/drawingml/2006/picture">
+                <pic:pic>
+                  <pic:nvPicPr>
+                    <pic:cNvPr id="0" name="Isometrica_Nazca_Caribe_h.png"/>
+                    <pic:cNvPicPr/>
+                  </pic:nvPicPr>
+                  <pic:blipFill>
+                    <a:blip r:embed="rId13"/>
+                    <a:stretch>
+                      <a:fillRect/>
+                    </a:stretch>
+                  </pic:blipFill>
+                  <pic:spPr>
+                    <a:xfrm>
+                      <a:off x="0" y="0"/>
+                      <a:ext cx="5778000" cy="4622400"/>
+                    </a:xfrm>
+                    <a:prstGeom prst="rect"/>
+                  </pic:spPr>
+                </pic:pic>
+              </a:graphicData>
+            </a:graphic>
+          </wp:inline>
+        </w:drawing>
+      </w:r>
+    </w:p>
+    <w:p>
+      <w:pPr>
+        <w:keepNext w:val="0"/>
+        <w:spacing w:line="240" w:lineRule="auto"/>
+        <w:jc w:val="both"/>
+      </w:pPr>
+      <w:r>
+        <w:t>Figura 3. Vista isométrica ortográfica de Nazca candidata (morado) y Caribe candidata (naranja), reconstruidas mediante NURBS con los datos finales del brazo λ = 20. Se muestran los 2897 sismos SGC de entrenamiento relocalizados, la frontera colombiana y los límites departamentales. Mayor opacidad: proximidad 3D ≤40 km a controles y soporte Vp activo; menor opacidad: continuidad interpolada. La línea discontinua representa la diagonal geográfica propuesta a profundidad cero; no impone contacto entre superficies. Son hipótesis de identidad tectónica, no interfaces validadas. Exageración vertical aproximada 3×.</w:t>
+      </w:r>
+    </w:p>
+    <w:p>
+      <w:pPr>
+        <w:keepNext/>
+        <w:spacing w:line="240" w:lineRule="auto"/>
+        <w:jc w:val="center"/>
+      </w:pPr>
+      <w:r>
+        <w:drawing>
+          <wp:inline xmlns:a="http://schemas.openxmlformats.org/drawingml/2006/main" xmlns:pic="http://schemas.openxmlformats.org/drawingml/2006/picture">
+            <wp:extent cx="5778000" cy="4622400"/>
+            <wp:docPr id="4" name="Picture 4"/>
+            <wp:cNvGraphicFramePr>
+              <a:graphicFrameLocks noChangeAspect="1"/>
+            </wp:cNvGraphicFramePr>
+            <a:graphic>
+              <a:graphicData uri="http://schemas.openxmlformats.org/drawingml/2006/picture">
+                <pic:pic>
+                  <pic:nvPicPr>
+                    <pic:cNvPr id="0" name="Isometrica_kmeans_h.png"/>
+                    <pic:cNvPicPr/>
+                  </pic:nvPicPr>
+                  <pic:blipFill>
+                    <a:blip r:embed="rId14"/>
+                    <a:stretch>
+                      <a:fillRect/>
+                    </a:stretch>
+                  </pic:blipFill>
+                  <pic:spPr>
+                    <a:xfrm>
+                      <a:off x="0" y="0"/>
+                      <a:ext cx="5778000" cy="4622400"/>
+                    </a:xfrm>
+                    <a:prstGeom prst="rect"/>
+                  </pic:spPr>
+                </pic:pic>
+              </a:graphicData>
+            </a:graphic>
+          </wp:inline>
+        </w:drawing>
+      </w:r>
+    </w:p>
+    <w:p>
+      <w:pPr>
+        <w:keepNext w:val="0"/>
+        <w:spacing w:line="240" w:lineRule="auto"/>
+        <w:jc w:val="both"/>
+      </w:pPr>
+      <w:r>
+        <w:t>Figura 4. Vista isométrica ortográfica de 1160 sismos SGC profundos clasificados por proximidad a los centroides de k-means con k = 2 y distancias físicas en km. El ajuste utiliza 706 celdas de 20 km con igual peso y 30 inicios. Los colores morado y naranja identifican grupos espaciales, sin identidad tectónica asignada. Las líneas a 60, 80 y 100 km son bisectores de los centroides; la línea discontinua en superficie es la diagonal histórica, no utilizada durante el agrupamiento. Frontera colombiana y límites departamentales; exageración vertical aproximada 3×. Silueta 0,585; acuerdo con la clasificación diagonal 90,1 % de las celdas.</w:t>
+      </w:r>
+    </w:p>
+    <w:p>
+      <w:pPr>
+        <w:spacing w:line="240" w:lineRule="auto"/>
+        <w:jc w:val="both"/>
+      </w:pPr>
+      <w:hyperlink r:id="rId15">
         <w:r>
           <w:rPr>
             <w:color w:val="000000"/>
@@ -3509,7 +3619,7 @@
         <w:spacing w:line="240" w:lineRule="auto"/>
         <w:jc w:val="both"/>
       </w:pPr>
-      <w:hyperlink r:id="rId14">
+      <w:hyperlink r:id="rId16">
         <w:r>
           <w:rPr>
             <w:color w:val="000000"/>
@@ -3524,7 +3634,7 @@
         <w:spacing w:line="240" w:lineRule="auto"/>
         <w:jc w:val="both"/>
       </w:pPr>
-      <w:hyperlink r:id="rId15">
+      <w:hyperlink r:id="rId17">
         <w:r>
           <w:rPr>
             <w:color w:val="000000"/>
@@ -3683,7 +3793,7 @@
         <w:spacing w:line="240" w:lineRule="auto"/>
         <w:jc w:val="both"/>
       </w:pPr>
-      <w:hyperlink r:id="rId16">
+      <w:hyperlink r:id="rId18">
         <w:r>
           <w:rPr>
             <w:color w:val="000000"/>
@@ -3698,7 +3808,7 @@
         <w:spacing w:line="240" w:lineRule="auto"/>
         <w:jc w:val="both"/>
       </w:pPr>
-      <w:hyperlink r:id="rId17">
+      <w:hyperlink r:id="rId19">
         <w:r>
           <w:rPr>
             <w:color w:val="000000"/>
@@ -3713,7 +3823,7 @@
         <w:spacing w:line="240" w:lineRule="auto"/>
         <w:jc w:val="both"/>
       </w:pPr>
-      <w:hyperlink r:id="rId18">
+      <w:hyperlink r:id="rId20">
         <w:r>
           <w:rPr>
             <w:color w:val="000000"/>
@@ -3728,7 +3838,7 @@
         <w:spacing w:line="240" w:lineRule="auto"/>
         <w:jc w:val="both"/>
       </w:pPr>
-      <w:hyperlink r:id="rId19">
+      <w:hyperlink r:id="rId21">
         <w:r>
           <w:rPr>
             <w:color w:val="000000"/>
@@ -3743,7 +3853,7 @@
         <w:spacing w:line="240" w:lineRule="auto"/>
         <w:jc w:val="both"/>
       </w:pPr>
-      <w:hyperlink r:id="rId20">
+      <w:hyperlink r:id="rId22">
         <w:r>
           <w:rPr>
             <w:color w:val="000000"/>
@@ -3758,7 +3868,7 @@
         <w:spacing w:line="240" w:lineRule="auto"/>
         <w:jc w:val="both"/>
       </w:pPr>
-      <w:hyperlink r:id="rId21">
+      <w:hyperlink r:id="rId23">
         <w:r>
           <w:rPr>
             <w:color w:val="000000"/>
@@ -3773,7 +3883,7 @@
         <w:spacing w:line="240" w:lineRule="auto"/>
         <w:jc w:val="both"/>
       </w:pPr>
-      <w:hyperlink r:id="rId22">
+      <w:hyperlink r:id="rId24">
         <w:r>
           <w:rPr>
             <w:color w:val="000000"/>
@@ -3788,7 +3898,7 @@
         <w:spacing w:line="240" w:lineRule="auto"/>
         <w:jc w:val="both"/>
       </w:pPr>
-      <w:hyperlink r:id="rId13">
+      <w:hyperlink r:id="rId15">
         <w:r>
           <w:rPr>
             <w:color w:val="000000"/>
@@ -3803,7 +3913,7 @@
         <w:spacing w:line="240" w:lineRule="auto"/>
         <w:jc w:val="both"/>
       </w:pPr>
-      <w:hyperlink r:id="rId14">
+      <w:hyperlink r:id="rId16">
         <w:r>
           <w:rPr>
             <w:color w:val="000000"/>
@@ -3818,7 +3928,7 @@
         <w:spacing w:line="240" w:lineRule="auto"/>
         <w:jc w:val="both"/>
       </w:pPr>
-      <w:hyperlink r:id="rId15">
+      <w:hyperlink r:id="rId17">
         <w:r>
           <w:rPr>
             <w:color w:val="000000"/>
@@ -3833,7 +3943,7 @@
         <w:spacing w:line="240" w:lineRule="auto"/>
         <w:jc w:val="both"/>
       </w:pPr>
-      <w:hyperlink r:id="rId23">
+      <w:hyperlink r:id="rId25">
         <w:r>
           <w:rPr>
             <w:color w:val="000000"/>
@@ -3848,7 +3958,7 @@
         <w:spacing w:line="240" w:lineRule="auto"/>
         <w:jc w:val="both"/>
       </w:pPr>
-      <w:hyperlink r:id="rId24">
+      <w:hyperlink r:id="rId26">
         <w:r>
           <w:rPr>
             <w:color w:val="000000"/>
@@ -3863,7 +3973,7 @@
         <w:spacing w:line="240" w:lineRule="auto"/>
         <w:jc w:val="both"/>
       </w:pPr>
-      <w:hyperlink r:id="rId25">
+      <w:hyperlink r:id="rId27">
         <w:r>
           <w:rPr>
             <w:color w:val="000000"/>

</xml_diff>